<commit_message>
Add condensed 1-page resume variant (DOCX and PDF)
Tighter typography and trimmed bullets; projects folded into WiLine.
Regenerator outputs both full (2-page) and 1-page exports.

Co-authored-by: Victor <vakinla.va@gmail.com>
</commit_message>
<xml_diff>
--- a/victor-akinla-software-engineer-resume.docx
+++ b/victor-akinla-software-engineer-resume.docx
@@ -31,6 +31,7 @@
     </w:p>
     <w:p>
       <w:pPr>
+        <w:spacing w:after="80"/>
         <w:jc w:val="center"/>
       </w:pPr>
       <w:r>
@@ -282,7 +283,7 @@
     </w:p>
     <w:p>
       <w:pPr>
-        <w:spacing w:after="40"/>
+        <w:spacing w:after="80"/>
       </w:pPr>
       <w:r>
         <w:rPr>
@@ -345,7 +346,6 @@
     <w:p>
       <w:pPr>
         <w:spacing w:after="40"/>
-        <w:ind w:left="0"/>
       </w:pPr>
       <w:r>
         <w:rPr>
@@ -366,7 +366,6 @@
     <w:p>
       <w:pPr>
         <w:spacing w:after="40"/>
-        <w:ind w:left="0"/>
       </w:pPr>
       <w:r>
         <w:rPr>
@@ -387,7 +386,6 @@
     <w:p>
       <w:pPr>
         <w:spacing w:after="40"/>
-        <w:ind w:left="0"/>
       </w:pPr>
       <w:r>
         <w:rPr>
@@ -408,7 +406,6 @@
     <w:p>
       <w:pPr>
         <w:spacing w:after="40"/>
-        <w:ind w:left="0"/>
       </w:pPr>
       <w:r>
         <w:rPr>
@@ -429,7 +426,6 @@
     <w:p>
       <w:pPr>
         <w:spacing w:after="40"/>
-        <w:ind w:left="0"/>
       </w:pPr>
       <w:r>
         <w:rPr>
@@ -450,7 +446,6 @@
     <w:p>
       <w:pPr>
         <w:spacing w:after="40"/>
-        <w:ind w:left="0"/>
       </w:pPr>
       <w:r>
         <w:rPr>

</xml_diff>